<commit_message>
chore: atualiza templates de procuração PF e PJ
Co-Authored-By: Claude Sonnet 4.6 <noreply@anthropic.com>
</commit_message>
<xml_diff>
--- a/templates/procuracao.docx
+++ b/templates/procuracao.docx
@@ -42,8 +42,8 @@
     </w:p>
     <w:p>
       <w:pPr>
-        <w:spacing w:line="360" w:lineRule="auto"/>
-        <w:ind w:left="-284" w:right="849"/>
+        <w:pStyle w:val="SemEspaamento"/>
+        <w:ind w:hanging="284"/>
         <w:rPr>
           <w:rFonts w:ascii="Tahoma" w:eastAsia="Tahoma" w:hAnsi="Tahoma" w:cs="Tahoma"/>
           <w:sz w:val="22"/>
@@ -82,7 +82,6 @@
       <w:r>
         <w:rPr>
           <w:rFonts w:ascii="Tahoma" w:hAnsi="Tahoma" w:cs="Tahoma"/>
-          <w:color w:val="000000"/>
           <w:sz w:val="22"/>
           <w:szCs w:val="22"/>
         </w:rPr>
@@ -92,7 +91,6 @@
       <w:r>
         <w:rPr>
           <w:rFonts w:ascii="Tahoma" w:hAnsi="Tahoma" w:cs="Tahoma"/>
-          <w:color w:val="000000"/>
           <w:sz w:val="22"/>
           <w:szCs w:val="22"/>
         </w:rPr>
@@ -102,7 +100,6 @@
       <w:r>
         <w:rPr>
           <w:rFonts w:ascii="Tahoma" w:hAnsi="Tahoma" w:cs="Tahoma"/>
-          <w:color w:val="000000"/>
           <w:sz w:val="22"/>
           <w:szCs w:val="22"/>
         </w:rPr>
@@ -111,7 +108,14 @@
       <w:r>
         <w:rPr>
           <w:rFonts w:ascii="Tahoma" w:hAnsi="Tahoma" w:cs="Tahoma"/>
-          <w:color w:val="000000"/>
+          <w:sz w:val="22"/>
+          <w:szCs w:val="22"/>
+        </w:rPr>
+        <w:br/>
+      </w:r>
+      <w:r>
+        <w:rPr>
+          <w:rFonts w:ascii="Tahoma" w:hAnsi="Tahoma" w:cs="Tahoma"/>
           <w:sz w:val="22"/>
           <w:szCs w:val="22"/>
         </w:rPr>
@@ -1355,6 +1359,7 @@
   <w:style w:type="character" w:default="1" w:styleId="Fontepargpadro">
     <w:name w:val="Default Paragraph Font"/>
     <w:uiPriority w:val="1"/>
+    <w:semiHidden/>
     <w:unhideWhenUsed/>
   </w:style>
   <w:style w:type="table" w:default="1" w:styleId="Tabelanormal">

</xml_diff>